<commit_message>
Add Conversatinal AI to my experience
</commit_message>
<xml_diff>
--- a/hhassan_CV.docx
+++ b/hhassan_CV.docx
@@ -522,7 +522,7 @@
           <w:szCs w:val="16"/>
           <w:lang w:eastAsia="ko-KR"/>
         </w:rPr>
-        <w:t>Senior Computer Vision Engineer with 9+ years building production, real-time vision systems</w:t>
+        <w:t>Senior Computer Vision Engineer with 9+ years taking vision systems from research to field-deployed product. Hands-on with thermal/IR image processing (defogging/dehazing, optical-flow anomalous-motion detection), multi-object tracking, and low-latency deployment on embedded NVIDIA hardware (Jetson, TensorRT, ONNX), alongside deep document-vision work — layout analysis at 98% F1, complex graphics-component analysis and understanding at 93% F1, and Arabic OCR systems shipped to production. First place in the ICFHR 2018 RASM international manuscript-recognition competition. Electrical &amp; Electronics Engineering background, with a track record of optimizing pipelines for resource-constrained edge devices and leading cross-functional hardware–software integration. Comfortable benchmarking and hardening trackers for dynamic, real-world condition</w:t>
       </w:r>
       <w:r>
         <w:rPr>
@@ -532,17 +532,7 @@
           <w:szCs w:val="16"/>
           <w:lang w:eastAsia="ko-KR"/>
         </w:rPr>
-        <w:t>,</w:t>
-      </w:r>
-      <w:r>
-        <w:rPr>
-          <w:rFonts w:ascii="Merriweather Light" w:eastAsia="SimSun" w:hAnsi="Merriweather Light" w:cs="Georgia"/>
-          <w:color w:val="000000" w:themeColor="text1"/>
-          <w:sz w:val="16"/>
-          <w:szCs w:val="16"/>
-          <w:lang w:eastAsia="ko-KR"/>
-        </w:rPr>
-        <w:t xml:space="preserve"> and taking algorithms from research to field-deployed product. Hands-on experience with thermal/IR image processing (defogging/dehazing and optical-flow-based anomalous-motion detection), multi-object tracking, and low-latency deployment on embedded NVIDIA hardware. Electrical &amp; Electronics Engineering background, with a track record of optimizing vision pipelines for resource-constrained edge devices (Jetson, TensorRT, ONNX) and leading cross-functional hardware–software integration. Comfortable benchmarking and hardening trackers for dynamic, real-world conditions.</w:t>
+        <w:t>s.</w:t>
       </w:r>
     </w:p>
     <w:p>
@@ -1114,6 +1104,28 @@
           <w:lang w:val="en-US" w:eastAsia="ko-KR"/>
         </w:rPr>
         <w:t>Beyond AI                                                                                                                                                                             March 2024 — Present, Remote, EMEA</w:t>
+      </w:r>
+    </w:p>
+    <w:p>
+      <w:pPr>
+        <w:spacing w:after="30" w:line="232" w:lineRule="auto"/>
+        <w:rPr>
+          <w:rFonts w:ascii="Merriweather Light" w:eastAsia="Merriweather Light" w:hAnsi="Merriweather Light" w:cs="Merriweather Light"/>
+          <w:color w:val="000000" w:themeColor="text1"/>
+          <w:sz w:val="16"/>
+          <w:szCs w:val="16"/>
+          <w:lang w:val="en-US" w:eastAsia="ko-KR"/>
+        </w:rPr>
+      </w:pPr>
+      <w:r>
+        <w:rPr>
+          <w:rFonts w:ascii="Merriweather Light" w:eastAsia="Merriweather Light" w:hAnsi="Merriweather Light" w:cs="Merriweather Light"/>
+          <w:color w:val="000000" w:themeColor="text1"/>
+          <w:sz w:val="16"/>
+          <w:szCs w:val="16"/>
+          <w:lang w:val="en-US" w:eastAsia="ko-KR"/>
+        </w:rPr>
+        <w:t>Computer Vision</w:t>
       </w:r>
     </w:p>
     <w:p>
@@ -1141,17 +1153,7 @@
           <w:szCs w:val="16"/>
           <w:lang w:val="en-US" w:eastAsia="ko-KR"/>
         </w:rPr>
-        <w:t>Built an in-house visual-prompt detector (region-prompt contrastive alignment) that adapts to new domains from a few reference images, with no re-training or re-labeling — +3 AP over YOLOE</w:t>
-      </w:r>
-      <w:r>
-        <w:rPr>
-          <w:rFonts w:ascii="Merriweather Light" w:eastAsia="Merriweather Light" w:hAnsi="Merriweather Light" w:cs="Merriweather Light"/>
-          <w:color w:val="000000" w:themeColor="text1"/>
-          <w:sz w:val="16"/>
-          <w:szCs w:val="16"/>
-          <w:lang w:val="en-US" w:eastAsia="ko-KR"/>
-        </w:rPr>
-        <w:t>.</w:t>
+        <w:t>Built an in-house visual-prompt detector (region-prompt contrastive alignment) that adapts to new domains from a few reference images, with no re-training or re-labeling — +3 AP over YOLOE.</w:t>
       </w:r>
     </w:p>
     <w:p>
@@ -1372,6 +1374,167 @@
     </w:p>
     <w:p>
       <w:pPr>
+        <w:spacing w:after="30" w:line="232" w:lineRule="auto"/>
+        <w:rPr>
+          <w:rFonts w:ascii="Merriweather Light" w:eastAsia="Merriweather Light" w:hAnsi="Merriweather Light" w:cs="Merriweather Light"/>
+          <w:color w:val="000000" w:themeColor="text1"/>
+          <w:sz w:val="16"/>
+          <w:szCs w:val="16"/>
+          <w:lang w:val="en-US" w:eastAsia="ko-KR"/>
+        </w:rPr>
+      </w:pPr>
+      <w:r>
+        <w:rPr>
+          <w:rFonts w:ascii="Merriweather Light" w:eastAsia="Merriweather Light" w:hAnsi="Merriweather Light" w:cs="Merriweather Light"/>
+          <w:color w:val="000000" w:themeColor="text1"/>
+          <w:sz w:val="16"/>
+          <w:szCs w:val="16"/>
+          <w:lang w:val="en-US" w:eastAsia="ko-KR"/>
+        </w:rPr>
+        <w:t>Document AI &amp; OCR</w:t>
+      </w:r>
+    </w:p>
+    <w:p>
+      <w:pPr>
+        <w:pStyle w:val="ListParagraph"/>
+        <w:numPr>
+          <w:ilvl w:val="0"/>
+          <w:numId w:val="2"/>
+        </w:numPr>
+        <w:spacing w:after="30" w:line="232" w:lineRule="auto"/>
+        <w:ind w:left="260" w:hanging="160"/>
+        <w:rPr>
+          <w:rFonts w:ascii="Merriweather Light" w:eastAsia="Merriweather Light" w:hAnsi="Merriweather Light" w:cs="Merriweather Light"/>
+          <w:color w:val="000000" w:themeColor="text1"/>
+          <w:sz w:val="16"/>
+          <w:szCs w:val="16"/>
+          <w:lang w:val="en-US" w:eastAsia="ko-KR"/>
+        </w:rPr>
+      </w:pPr>
+      <w:r>
+        <w:rPr>
+          <w:rFonts w:ascii="Merriweather Light" w:eastAsia="Merriweather Light" w:hAnsi="Merriweather Light" w:cs="Merriweather Light"/>
+          <w:color w:val="000000" w:themeColor="text1"/>
+          <w:sz w:val="16"/>
+          <w:szCs w:val="16"/>
+          <w:lang w:val="en-US" w:eastAsia="ko-KR"/>
+        </w:rPr>
+        <w:lastRenderedPageBreak/>
+        <w:t>Built layout analysis and complex graphics-component analysis for Arabic documents — 98% F1 on layout regions,</w:t>
+      </w:r>
+      <w:r>
+        <w:rPr>
+          <w:rFonts w:ascii="Merriweather Light" w:eastAsia="Merriweather Light" w:hAnsi="Merriweather Light" w:cs="Merriweather Light"/>
+          <w:color w:val="000000" w:themeColor="text1"/>
+          <w:sz w:val="16"/>
+          <w:szCs w:val="16"/>
+          <w:lang w:val="en-US" w:eastAsia="ko-KR"/>
+        </w:rPr>
+        <w:t xml:space="preserve"> </w:t>
+      </w:r>
+      <w:r>
+        <w:rPr>
+          <w:rFonts w:ascii="Merriweather Light" w:eastAsia="Merriweather Light" w:hAnsi="Merriweather Light" w:cs="Merriweather Light"/>
+          <w:color w:val="000000" w:themeColor="text1"/>
+          <w:sz w:val="16"/>
+          <w:szCs w:val="16"/>
+          <w:lang w:val="en-US" w:eastAsia="ko-KR"/>
+        </w:rPr>
+        <w:t>93% F1 on graphics components, and 84% on graphics reasoning/understanding (chart and diagram semantics,</w:t>
+      </w:r>
+      <w:r>
+        <w:rPr>
+          <w:rFonts w:ascii="Merriweather Light" w:eastAsia="Merriweather Light" w:hAnsi="Merriweather Light" w:cs="Merriweather Light"/>
+          <w:color w:val="000000" w:themeColor="text1"/>
+          <w:sz w:val="16"/>
+          <w:szCs w:val="16"/>
+          <w:lang w:val="en-US" w:eastAsia="ko-KR"/>
+        </w:rPr>
+        <w:t xml:space="preserve"> </w:t>
+      </w:r>
+      <w:r>
+        <w:rPr>
+          <w:rFonts w:ascii="Merriweather Light" w:eastAsia="Merriweather Light" w:hAnsi="Merriweather Light" w:cs="Merriweather Light"/>
+          <w:color w:val="000000" w:themeColor="text1"/>
+          <w:sz w:val="16"/>
+          <w:szCs w:val="16"/>
+          <w:lang w:val="en-US" w:eastAsia="ko-KR"/>
+        </w:rPr>
+        <w:t>figure–caption linkage).</w:t>
+      </w:r>
+    </w:p>
+    <w:p>
+      <w:pPr>
+        <w:pStyle w:val="ListParagraph"/>
+        <w:numPr>
+          <w:ilvl w:val="0"/>
+          <w:numId w:val="2"/>
+        </w:numPr>
+        <w:spacing w:after="30" w:line="232" w:lineRule="auto"/>
+        <w:ind w:left="260" w:hanging="160"/>
+        <w:rPr>
+          <w:rFonts w:ascii="Merriweather Light" w:eastAsia="Merriweather Light" w:hAnsi="Merriweather Light" w:cs="Merriweather Light"/>
+          <w:color w:val="000000" w:themeColor="text1"/>
+          <w:sz w:val="16"/>
+          <w:szCs w:val="16"/>
+          <w:lang w:val="en-US" w:eastAsia="ko-KR"/>
+        </w:rPr>
+      </w:pPr>
+      <w:r>
+        <w:rPr>
+          <w:rFonts w:ascii="Merriweather Light" w:eastAsia="Merriweather Light" w:hAnsi="Merriweather Light" w:cs="Merriweather Light"/>
+          <w:color w:val="000000" w:themeColor="text1"/>
+          <w:sz w:val="16"/>
+          <w:szCs w:val="16"/>
+          <w:lang w:val="en-US" w:eastAsia="ko-KR"/>
+        </w:rPr>
+        <w:t xml:space="preserve">Fine-tuned </w:t>
+      </w:r>
+      <w:proofErr w:type="spellStart"/>
+      <w:r>
+        <w:rPr>
+          <w:rFonts w:ascii="Merriweather Light" w:eastAsia="Merriweather Light" w:hAnsi="Merriweather Light" w:cs="Merriweather Light"/>
+          <w:color w:val="000000" w:themeColor="text1"/>
+          <w:sz w:val="16"/>
+          <w:szCs w:val="16"/>
+          <w:lang w:val="en-US" w:eastAsia="ko-KR"/>
+        </w:rPr>
+        <w:t>PaddleOCR</w:t>
+      </w:r>
+      <w:proofErr w:type="spellEnd"/>
+      <w:r>
+        <w:rPr>
+          <w:rFonts w:ascii="Merriweather Light" w:eastAsia="Merriweather Light" w:hAnsi="Merriweather Light" w:cs="Merriweather Light"/>
+          <w:color w:val="000000" w:themeColor="text1"/>
+          <w:sz w:val="16"/>
+          <w:szCs w:val="16"/>
+          <w:lang w:val="en-US" w:eastAsia="ko-KR"/>
+        </w:rPr>
+        <w:t xml:space="preserve"> for Arabic text recognition — 14% WER general and </w:t>
+      </w:r>
+      <w:r>
+        <w:rPr>
+          <w:rFonts w:ascii="Cambria Math" w:eastAsia="Merriweather Light" w:hAnsi="Cambria Math" w:cs="Cambria Math"/>
+          <w:color w:val="000000" w:themeColor="text1"/>
+          <w:sz w:val="16"/>
+          <w:szCs w:val="16"/>
+          <w:lang w:val="en-US" w:eastAsia="ko-KR"/>
+        </w:rPr>
+        <w:t>∼</w:t>
+      </w:r>
+      <w:r>
+        <w:rPr>
+          <w:rFonts w:ascii="Merriweather Light" w:eastAsia="Merriweather Light" w:hAnsi="Merriweather Light" w:cs="Merriweather Light"/>
+          <w:color w:val="000000" w:themeColor="text1"/>
+          <w:sz w:val="16"/>
+          <w:szCs w:val="16"/>
+          <w:lang w:val="en-US" w:eastAsia="ko-KR"/>
+        </w:rPr>
+        <w:t>8% WER on domain-specific documents— handling cursive script, ligatures, and right-to-left layout</w:t>
+      </w:r>
+    </w:p>
+    <w:p>
+      <w:pPr>
         <w:spacing w:line="270" w:lineRule="auto"/>
         <w:rPr>
           <w:rFonts w:ascii="Merriweather" w:eastAsia="Merriweather" w:hAnsi="Merriweather" w:cs="Merriweather"/>
@@ -1428,7 +1591,6 @@
         </w:rPr>
         <w:t xml:space="preserve"> (Digital Identity/</w:t>
       </w:r>
-      <w:proofErr w:type="spellStart"/>
       <w:proofErr w:type="gramStart"/>
       <w:r>
         <w:rPr>
@@ -1438,18 +1600,7 @@
           <w:szCs w:val="16"/>
           <w:lang w:val="en-US" w:eastAsia="ko-KR"/>
         </w:rPr>
-        <w:t>eKYC</w:t>
-      </w:r>
-      <w:proofErr w:type="spellEnd"/>
-      <w:r>
-        <w:rPr>
-          <w:rFonts w:ascii="Merriweather Light" w:eastAsia="Merriweather Light" w:hAnsi="Merriweather Light" w:cs="Merriweather Light"/>
-          <w:color w:val="000000" w:themeColor="text1"/>
-          <w:sz w:val="16"/>
-          <w:szCs w:val="16"/>
-          <w:lang w:val="en-US" w:eastAsia="ko-KR"/>
-        </w:rPr>
-        <w:t xml:space="preserve">)   </w:t>
+        <w:t xml:space="preserve">eKYC)   </w:t>
       </w:r>
       <w:proofErr w:type="gramEnd"/>
       <w:r>
@@ -1514,7 +1665,6 @@
           <w:szCs w:val="16"/>
           <w:lang w:val="en-US" w:eastAsia="ko-KR"/>
         </w:rPr>
-        <w:lastRenderedPageBreak/>
         <w:t>Built validation and quality-control workflows for OCR, face matching, liveness, and identity-verification datasets, improving verification success rate by 20% through data quality tuning and systematic failure analysis.</w:t>
       </w:r>
     </w:p>

</xml_diff>